<commit_message>
Actualiza el Manual Tecnico con las variables de entorno reales de despliegue
Faltaban EMAIL_USER, EMAIL_APP_PASSWORD, APP_URL y TRUST_PROXY en la seccion
de configuracion (existen en el .env real y se usan en el codigo, pero no
estaban documentadas). Tambien se corrigio la lista de carpetas de uploads/
que crea el middleware (eran 6, el manual solo mencionaba 3).

Co-Authored-By: Claude Sonnet 5 <noreply@anthropic.com>
</commit_message>
<xml_diff>
--- a/docs/Manual_Tecnico_LMS_CeNAT.docx
+++ b/docs/Manual_Tecnico_LMS_CeNAT.docx
@@ -1625,7 +1625,41 @@
           <w:sz w:val="20"/>
           <w:szCs w:val="20"/>
         </w:rPr>
-        <w:t>SESSION_SECRET=cadena_aleatoria_segura_aqui</w:t>
+        <w:t xml:space="preserve">SESSION_SECRET=cadena_aleatoria_segura_aqui  EMAIL_USER=tu_correo@gmail.com EMAIL_APP_PASSWORD=contraseña_de_aplicación_gmail  APP_URL=https://tu-dominio-real.com  </w:t>
+      </w:r>
+      <w:r>
+        <w:rPr>
+          <w:rFonts w:ascii="Consolas" w:eastAsia="Consolas" w:hAnsi="Consolas" w:cs="Consolas"/>
+          <w:color w:val="333333"/>
+          <w:sz w:val="20"/>
+          <w:szCs w:val="20"/>
+        </w:rPr>
+        <w:t>TRUST_PROXY=1  UPLOADS_DIR=</w:t>
+      </w:r>
+      <w:r>
+        <w:rPr>
+          <w:rFonts w:ascii="Consolas" w:eastAsia="Consolas" w:hAnsi="Consolas" w:cs="Consolas"/>
+          <w:color w:val="333333"/>
+          <w:sz w:val="20"/>
+          <w:szCs w:val="20"/>
+        </w:rPr>
+        <w:t>/ruta/opcional/en/otro/disco</w:t>
+      </w:r>
+    </w:p>
+    <w:p>
+      <w:pPr>
+        <w:spacing w:after="150"/>
+      </w:pPr>
+      <w:r>
+        <w:t>EMAIL_USER, EMAIL_APP_PASSWORD y APP_URL son opcionales, pero sin ellas la recuperación de contraseña no llega a enviarse por correo: el enlace queda impreso en la consola del servidor, y si tampoco se define APP_URL, ese enlace apunta a http://localhost:3000 en vez del dominio real. EMAIL_APP_PASSWORD se genera en https://myaccount.google.com/apppasswords (requiere verificación en 2 pasos activada en la cuenta de Gmail remitente). TRUST_PROXY solo debe activarse si el servidor corre detrás de un reverse proxy como Nginx (ver 7.5) - activarla sin uno permitiría a cualquier cliente falsificar su IP y saltarse el límite de intentos de login/registro.</w:t>
+      </w:r>
+    </w:p>
+    <w:p>
+      <w:pPr>
+        <w:spacing w:after="150"/>
+      </w:pPr>
+      <w:r>
+        <w:t>UPLOADS_DIR es opcional y permite guardar los archivos subidos (videos, imágenes, tareas, avatares, miniaturas) en otro disco o en una unidad de red montada, en vez de la carpeta uploads/ dentro del propio proyecto — útil si el servidor de despliegue separa el almacenamiento de archivos del código de la aplicación.</w:t>
       </w:r>
     </w:p>
     <w:p>
@@ -1665,6 +1699,7 @@
         <w:spacing w:before="300" w:after="150"/>
       </w:pPr>
       <w:r>
+        <w:lastRenderedPageBreak/>
         <w:t>3.4 Crear la Base de Datos</w:t>
       </w:r>
     </w:p>
@@ -1713,8 +1748,13 @@
         <w:spacing w:after="150"/>
       </w:pPr>
       <w:r>
-        <w:lastRenderedPageBreak/>
-        <w:t>El middleware de subida de archivos (src/middlewares/upload.middleware.js) crea automáticamente las carpetas uploads/videos, uploads/files y uploads/thumbnails si no existen al arrancar el servidor. De forma opcional, pueden crearse manualmente con anticipación:</w:t>
+        <w:t xml:space="preserve">El middleware de subida de archivos (src/middlewares/upload.middleware.js) crea automáticamente las </w:t>
+      </w:r>
+      <w:r>
+        <w:t>carpetas uploads/videos, uploads/files, uploads/thumbnails, uploads/submissions, uploads/content-images y uploads/avatars si no existen</w:t>
+      </w:r>
+      <w:r>
+        <w:t xml:space="preserve"> al arrancar el servidor. De forma opcional, pueden crearse manualmente con anticipación:</w:t>
       </w:r>
     </w:p>
     <w:p>
@@ -1729,7 +1769,7 @@
           <w:sz w:val="20"/>
           <w:szCs w:val="20"/>
         </w:rPr>
-        <w:t>New-Item -ItemType Directory -Force -Path uploads/videos, uploads/files, uploads/thumbnails</w:t>
+        <w:t>New-Item -ItemType Directory -Force -Path uploads/videos, uploads/files, uploads/thumbnails, uploads/submissions, uploads/content-images, uploads/avatars</w:t>
       </w:r>
     </w:p>
     <w:p>
@@ -2394,6 +2434,7 @@
         <w:spacing w:before="300" w:after="150"/>
       </w:pPr>
       <w:r>
+        <w:lastRenderedPageBreak/>
         <w:t>5.1 Autenticación — /api/auth</w:t>
       </w:r>
     </w:p>
@@ -2966,7 +3007,6 @@
     </w:tbl>
     <w:p>
       <w:r>
-        <w:lastRenderedPageBreak/>
         <w:t>El login (POST /api/auth/login) acepta correo electrónico o nombre de usuario indistintamente en el mismo campo. El catálogo público (GET /api/courses, GET /api/contents/course/:id) es accesible sin sesión (modo invitado); las URLs reales de video/archivo permanecen ocultas hasta inscribirse. Cada inicio de sesión exitoso actualiza users.last_login.</w:t>
       </w:r>
     </w:p>
@@ -4395,6 +4435,7 @@
                 <w:sz w:val="18"/>
                 <w:szCs w:val="18"/>
               </w:rPr>
+              <w:lastRenderedPageBreak/>
               <w:t>POST</w:t>
             </w:r>
           </w:p>
@@ -4863,7 +4904,6 @@
                 <w:sz w:val="18"/>
                 <w:szCs w:val="18"/>
               </w:rPr>
-              <w:lastRenderedPageBreak/>
               <w:t>POST</w:t>
             </w:r>
           </w:p>

</xml_diff>